<commit_message>
feat(p4): seller director in Turkmen (Latin) for the contract's TK column
The bilingual export contract printed the seller's director from the single
Cyrillic ExportFirm.director in both language columns. Add ExportFirm.director_tk
(Turkmen/Latin spelling, migration core.0030) and split the template's
{{ seller_director }} into {{ seller_director_tk }} (from director_tk, falling
back to director) and {{ seller_director_ru }} (from director). Editable on the
export-firm admin page.

manage.py check clean; frontend tsc clean.

Co-Authored-By: Claude Opus 4.8 (1M context) <noreply@anthropic.com>
</commit_message>
<xml_diff>
--- a/backend/apps/contracts/document_templates/contract_kz.docx
+++ b/backend/apps/contracts/document_templates/contract_kz.docx
@@ -455,7 +455,7 @@
                 <w:szCs w:val="22"/>
                 <w:lang w:val="tk-TM"/>
               </w:rPr>
-              <w:t>“{{ seller_name_tk }}” HJ-iň (Türkmenistan), Tertipnama laýyklykda hereket edýän Direktor {{ seller_director }}</w:t>
+              <w:t>“{{ seller_name_tk }}” HJ-iň (Türkmenistan), Tertipnama laýyklykda hereket edýän Direktor {{ seller_director_tk }}</w:t>
             </w:r>
             <w:r>
               <w:rPr>
@@ -737,7 +737,7 @@
                 <w:sz w:val="22"/>
                 <w:szCs w:val="22"/>
               </w:rPr>
-              <w:t>(Туркменистан), в лице Директора {{ seller_director }}</w:t>
+              <w:t>(Туркменистан), в лице Директора {{ seller_director_ru }}</w:t>
             </w:r>
             <w:r>
               <w:rPr>
@@ -7181,7 +7181,7 @@
                 <w:szCs w:val="22"/>
                 <w:lang w:val="tk-TM"/>
               </w:rPr>
-              <w:t xml:space="preserve">       {{ seller_director }}</w:t>
+              <w:t xml:space="preserve">       {{ seller_director_tk }}</w:t>
             </w:r>
             <w:r>
               <w:t xml:space="preserve">  {{ seller_seal }}{{ seller_signature }}</w:t>
@@ -7244,7 +7244,7 @@
                 <w:sz w:val="22"/>
                 <w:szCs w:val="22"/>
               </w:rPr>
-              <w:t>{{ seller_director }}</w:t>
+              <w:t>{{ seller_director_ru }}</w:t>
             </w:r>
             <w:r>
               <w:rPr>
@@ -9588,7 +9588,7 @@
                 <w:b/>
                 <w:lang w:val="tk-TM"/>
               </w:rPr>
-              <w:t>{{ seller_director }}</w:t>
+              <w:t>{{ seller_director_ru }}</w:t>
             </w:r>
             <w:r>
               <w:rPr>
@@ -9614,7 +9614,7 @@
                 <w:sz w:val="24"/>
                 <w:lang w:val="tk-TM"/>
               </w:rPr>
-              <w:t>Direktor                      {{ seller_director }}</w:t>
+              <w:t>Direktor                      {{ seller_director_tk }}</w:t>
             </w:r>
           </w:p>
           <w:p>

</xml_diff>